<commit_message>
Update links to Find a private mediator on the Professional Mediators of  Alaska website in accordion_steps and docx  AKA2JBranding Issue #16 https://github.com/A2JatAKCourts/docassemble-AKA2JBrandingIssues/issues/66
</commit_message>
<xml_diff>
--- a/docassemble/StartingChildCustodyActionPlan/data/templates/starting_child_custody_action_plan.docx
+++ b/docassemble/StartingChildCustodyActionPlan/data/templates/starting_child_custody_action_plan.docx
@@ -926,27 +926,14 @@
             <w:r>
               <w:t xml:space="preserve">Step </w:t>
             </w:r>
-            <w:r>
-              <w:fldChar w:fldCharType="begin"/>
-            </w:r>
-            <w:r>
-              <w:instrText xml:space="preserve"> SEQ stepList \r 1 \* MERGEFORMAT </w:instrText>
-            </w:r>
-            <w:r>
-              <w:fldChar w:fldCharType="separate"/>
-            </w:r>
-            <w:r>
-              <w:rPr>
-                <w:noProof/>
-              </w:rPr>
-              <w:t>1</w:t>
-            </w:r>
-            <w:r>
-              <w:rPr>
-                <w:noProof/>
-              </w:rPr>
-              <w:fldChar w:fldCharType="end"/>
-            </w:r>
+            <w:fldSimple w:instr=" SEQ stepList \r 1 \* MERGEFORMAT ">
+              <w:r>
+                <w:rPr>
+                  <w:noProof/>
+                </w:rPr>
+                <w:t>1</w:t>
+              </w:r>
+            </w:fldSimple>
             <w:r>
               <w:t xml:space="preserve">: </w:t>
             </w:r>
@@ -6295,7 +6282,6 @@
               <w:t xml:space="preserve"> and </w:t>
             </w:r>
             <w:hyperlink r:id="rId74" w:anchor="L247" w:history="1">
-              <w:proofErr w:type="spellStart"/>
               <w:r>
                 <w:rPr>
                   <w:rStyle w:val="Hyperlink"/>
@@ -6303,7 +6289,6 @@
                 </w:rPr>
                 <w:t>read_drpo_step</w:t>
               </w:r>
-              <w:proofErr w:type="spellEnd"/>
             </w:hyperlink>
             <w:r>
               <w:rPr>
@@ -14487,27 +14472,14 @@
     <w:r>
       <w:t xml:space="preserve"> of </w:t>
     </w:r>
-    <w:r>
-      <w:fldChar w:fldCharType="begin"/>
-    </w:r>
-    <w:r>
-      <w:instrText xml:space="preserve"> NUMPAGES  \* Arabic  \* MERGEFORMAT </w:instrText>
-    </w:r>
-    <w:r>
-      <w:fldChar w:fldCharType="separate"/>
-    </w:r>
-    <w:r>
-      <w:rPr>
-        <w:noProof/>
-      </w:rPr>
-      <w:t>22</w:t>
-    </w:r>
-    <w:r>
-      <w:rPr>
-        <w:noProof/>
-      </w:rPr>
-      <w:fldChar w:fldCharType="end"/>
-    </w:r>
+    <w:fldSimple w:instr=" NUMPAGES  \* Arabic  \* MERGEFORMAT ">
+      <w:r>
+        <w:rPr>
+          <w:noProof/>
+        </w:rPr>
+        <w:t>22</w:t>
+      </w:r>
+    </w:fldSimple>
     <w:r>
       <w:t xml:space="preserve"> pages</w:t>
     </w:r>
@@ -14519,13 +14491,16 @@
       <w:ind w:left="-630"/>
     </w:pPr>
     <w:r>
-      <w:t>March</w:t>
+      <w:t>Ma</w:t>
+    </w:r>
+    <w:r>
+      <w:t>y</w:t>
     </w:r>
     <w:r>
       <w:t xml:space="preserve"> </w:t>
     </w:r>
     <w:r>
-      <w:t>12</w:t>
+      <w:t>1</w:t>
     </w:r>
     <w:r>
       <w:t>, 202</w:t>

</xml_diff>

<commit_message>
forgot to update links in docx Links in this step
</commit_message>
<xml_diff>
--- a/docassemble/StartingChildCustodyActionPlan/data/templates/starting_child_custody_action_plan.docx
+++ b/docassemble/StartingChildCustodyActionPlan/data/templates/starting_child_custody_action_plan.docx
@@ -47,21 +47,7 @@
               <w:rPr>
                 <w:rFonts w:eastAsia="Arial"/>
               </w:rPr>
-              <w:t xml:space="preserve">{ </w:t>
-            </w:r>
-            <w:proofErr w:type="spellStart"/>
-            <w:r>
-              <w:rPr>
-                <w:rFonts w:eastAsia="Arial"/>
-              </w:rPr>
-              <w:t>all_variables</w:t>
-            </w:r>
-            <w:proofErr w:type="spellEnd"/>
-            <w:r>
-              <w:rPr>
-                <w:rFonts w:eastAsia="Arial"/>
-              </w:rPr>
-              <w:t>(special='metadata').get(</w:t>
+              <w:t>{ all_variables(special='metadata').get(</w:t>
             </w:r>
             <w:r>
               <w:rPr>
@@ -891,11 +877,9 @@
             </w:tcMar>
           </w:tcPr>
           <w:p>
-            <w:proofErr w:type="spellStart"/>
             <w:r>
               <w:t>wrong_tf</w:t>
             </w:r>
-            <w:proofErr w:type="spellEnd"/>
             <w:r>
               <w:t xml:space="preserve"> and </w:t>
             </w:r>
@@ -926,14 +910,27 @@
             <w:r>
               <w:t xml:space="preserve">Step </w:t>
             </w:r>
-            <w:fldSimple w:instr=" SEQ stepList \r 1 \* MERGEFORMAT ">
-              <w:r>
-                <w:rPr>
-                  <w:noProof/>
-                </w:rPr>
-                <w:t>1</w:t>
-              </w:r>
-            </w:fldSimple>
+            <w:r>
+              <w:fldChar w:fldCharType="begin"/>
+            </w:r>
+            <w:r>
+              <w:instrText xml:space="preserve"> SEQ stepList \r 1 \* MERGEFORMAT </w:instrText>
+            </w:r>
+            <w:r>
+              <w:fldChar w:fldCharType="separate"/>
+            </w:r>
+            <w:r>
+              <w:rPr>
+                <w:noProof/>
+              </w:rPr>
+              <w:t>1</w:t>
+            </w:r>
+            <w:r>
+              <w:rPr>
+                <w:noProof/>
+              </w:rPr>
+              <w:fldChar w:fldCharType="end"/>
+            </w:r>
             <w:r>
               <w:t xml:space="preserve">: </w:t>
             </w:r>
@@ -987,13 +984,8 @@
               <w:br/>
             </w:r>
             <w:r>
-              <w:t>docassemble.akcourts.gov/start/</w:t>
-            </w:r>
-            <w:proofErr w:type="spellStart"/>
-            <w:r>
-              <w:t>DivorceAndSeparation</w:t>
-            </w:r>
-            <w:proofErr w:type="spellEnd"/>
+              <w:t>docassemble.akcourts.gov/start/DivorceAndSeparation</w:t>
+            </w:r>
           </w:p>
         </w:tc>
       </w:tr>
@@ -1266,11 +1258,9 @@
             <w:pPr>
               <w:pStyle w:val="Body"/>
             </w:pPr>
-            <w:proofErr w:type="spellStart"/>
             <w:r>
               <w:t>jurisdiction_step</w:t>
             </w:r>
-            <w:proofErr w:type="spellEnd"/>
           </w:p>
         </w:tc>
       </w:tr>
@@ -1512,14 +1502,12 @@
             <w:r>
               <w:t xml:space="preserve">{%tr if </w:t>
             </w:r>
-            <w:proofErr w:type="spellStart"/>
             <w:r>
               <w:t>alternate</w:t>
             </w:r>
             <w:r>
               <w:t>_service</w:t>
             </w:r>
-            <w:proofErr w:type="spellEnd"/>
             <w:r>
               <w:t xml:space="preserve"> %}</w:t>
             </w:r>
@@ -1538,11 +1526,9 @@
             <w:pPr>
               <w:pStyle w:val="Body"/>
             </w:pPr>
-            <w:proofErr w:type="spellStart"/>
             <w:r>
               <w:t>alternate_service_step</w:t>
             </w:r>
-            <w:proofErr w:type="spellEnd"/>
             <w:r>
               <w:t xml:space="preserve"> in </w:t>
             </w:r>
@@ -3159,7 +3145,6 @@
             <w:r>
               <w:t>which_forms in ('</w:t>
             </w:r>
-            <w:proofErr w:type="spellStart"/>
             <w:r>
               <w:t>agree</w:t>
             </w:r>
@@ -3172,7 +3157,6 @@
             <w:r>
               <w:t>both</w:t>
             </w:r>
-            <w:proofErr w:type="spellEnd"/>
             <w:r>
               <w:t>'</w:t>
             </w:r>
@@ -3208,11 +3192,9 @@
             <w:pPr>
               <w:pStyle w:val="Body"/>
             </w:pPr>
-            <w:proofErr w:type="spellStart"/>
             <w:r>
               <w:t>uncontested_forms_step</w:t>
             </w:r>
-            <w:proofErr w:type="spellEnd"/>
           </w:p>
         </w:tc>
       </w:tr>
@@ -4114,7 +4096,7 @@
               <w:br/>
             </w:r>
             <w:r>
-              <w:t>alaskamediators.org/directory</w:t>
+              <w:t>pmoa.wildapricot.org/directory</w:t>
             </w:r>
           </w:p>
           <w:p>
@@ -4152,15 +4134,7 @@
               <w:br/>
             </w:r>
             <w:r>
-              <w:t>youtube.com/</w:t>
-            </w:r>
-            <w:proofErr w:type="spellStart"/>
-            <w:r>
-              <w:t>watch?v</w:t>
-            </w:r>
-            <w:proofErr w:type="spellEnd"/>
-            <w:r>
-              <w:t>=4EuW9HET3nM</w:t>
+              <w:t>youtube.com/watch?v=4EuW9HET3nM</w:t>
             </w:r>
           </w:p>
           <w:p>
@@ -5286,11 +5260,9 @@
             <w:pPr>
               <w:pStyle w:val="Body"/>
             </w:pPr>
-            <w:proofErr w:type="spellStart"/>
             <w:r>
               <w:t>contested_forms_step</w:t>
             </w:r>
-            <w:proofErr w:type="spellEnd"/>
           </w:p>
         </w:tc>
       </w:tr>
@@ -6265,7 +6237,6 @@
               <w:pStyle w:val="Body"/>
             </w:pPr>
             <w:hyperlink r:id="rId73" w:anchor="L198" w:history="1">
-              <w:proofErr w:type="spellStart"/>
               <w:r>
                 <w:rPr>
                   <w:rStyle w:val="Hyperlink"/>
@@ -6273,7 +6244,6 @@
                 </w:rPr>
                 <w:t>file_complaint_step</w:t>
               </w:r>
-              <w:proofErr w:type="spellEnd"/>
             </w:hyperlink>
             <w:r>
               <w:rPr>
@@ -6401,21 +6371,7 @@
               <w:rPr>
                 <w:color w:val="00B050"/>
               </w:rPr>
-              <w:t>{% if which_forms in('</w:t>
-            </w:r>
-            <w:proofErr w:type="spellStart"/>
-            <w:r>
-              <w:rPr>
-                <w:color w:val="00B050"/>
-              </w:rPr>
-              <w:t>agree','both</w:t>
-            </w:r>
-            <w:proofErr w:type="spellEnd"/>
-            <w:r>
-              <w:rPr>
-                <w:color w:val="00B050"/>
-              </w:rPr>
-              <w:t xml:space="preserve">') </w:t>
+              <w:t xml:space="preserve">{% if which_forms in('agree','both') </w:t>
             </w:r>
             <w:r>
               <w:rPr>
@@ -6996,15 +6952,7 @@
               </w:rPr>
             </w:pPr>
             <w:r>
-              <w:t>{% if which_forms in('</w:t>
-            </w:r>
-            <w:proofErr w:type="spellStart"/>
-            <w:r>
-              <w:t>agree','both</w:t>
-            </w:r>
-            <w:proofErr w:type="spellEnd"/>
-            <w:r>
-              <w:t>') %}</w:t>
+              <w:t>{% if which_forms in('agree','both') %}</w:t>
             </w:r>
             <w:r>
               <w:t>Note</w:t>
@@ -7085,21 +7033,8 @@
               <w:br/>
             </w:r>
             <w:r>
-              <w:t>courts.alaska.gov/</w:t>
-            </w:r>
-            <w:proofErr w:type="spellStart"/>
-            <w:r>
-              <w:t>courtdir</w:t>
-            </w:r>
-            <w:proofErr w:type="spellEnd"/>
-            <w:r>
-              <w:t>/</w:t>
-            </w:r>
-            <w:proofErr w:type="spellStart"/>
-            <w:r>
-              <w:t>index.htm#trial</w:t>
-            </w:r>
-            <w:proofErr w:type="spellEnd"/>
+              <w:t>courts.alaska.gov/courtdir/index.htm#trial</w:t>
+            </w:r>
           </w:p>
           <w:p>
             <w:pPr>
@@ -7121,21 +7056,8 @@
               <w:br/>
             </w:r>
             <w:r>
-              <w:t>courts.alaska.gov/</w:t>
-            </w:r>
-            <w:proofErr w:type="spellStart"/>
-            <w:r>
-              <w:t>efile</w:t>
-            </w:r>
-            <w:proofErr w:type="spellEnd"/>
-            <w:r>
-              <w:t>/</w:t>
-            </w:r>
-            <w:proofErr w:type="spellStart"/>
-            <w:r>
-              <w:t>index.htm#current-courts</w:t>
-            </w:r>
-            <w:proofErr w:type="spellEnd"/>
+              <w:t>courts.alaska.gov/efile/index.htm#current-courts</w:t>
+            </w:r>
           </w:p>
           <w:p>
             <w:pPr>
@@ -7153,15 +7075,7 @@
               <w:br/>
             </w:r>
             <w:r>
-              <w:t>courts.alaska.gov/</w:t>
-            </w:r>
-            <w:proofErr w:type="spellStart"/>
-            <w:r>
-              <w:t>courtdir</w:t>
-            </w:r>
-            <w:proofErr w:type="spellEnd"/>
-            <w:r>
-              <w:t>/efiling.htm</w:t>
+              <w:t>courts.alaska.gov/courtdir/efiling.htm</w:t>
             </w:r>
           </w:p>
           <w:p>
@@ -7910,11 +7824,9 @@
             </w:tcMar>
           </w:tcPr>
           <w:p>
-            <w:proofErr w:type="spellStart"/>
             <w:r>
               <w:t>serve_complaint_step</w:t>
             </w:r>
-            <w:proofErr w:type="spellEnd"/>
             <w:r>
               <w:t xml:space="preserve"> in </w:t>
             </w:r>
@@ -9013,11 +8925,9 @@
             <w:pPr>
               <w:pStyle w:val="Body"/>
             </w:pPr>
-            <w:proofErr w:type="spellStart"/>
             <w:r>
               <w:t>expect_after_complaint_step</w:t>
             </w:r>
-            <w:proofErr w:type="spellEnd"/>
             <w:r>
               <w:t xml:space="preserve"> in </w:t>
             </w:r>
@@ -9136,21 +9046,7 @@
                 <w:color w:val="C00000"/>
               </w:rPr>
               <w:lastRenderedPageBreak/>
-              <w:t xml:space="preserve">{% if user_need == 'custody' and </w:t>
-            </w:r>
-            <w:proofErr w:type="spellStart"/>
-            <w:r>
-              <w:rPr>
-                <w:color w:val="C00000"/>
-              </w:rPr>
-              <w:t>alternate_service</w:t>
-            </w:r>
-            <w:proofErr w:type="spellEnd"/>
-            <w:r>
-              <w:rPr>
-                <w:color w:val="C00000"/>
-              </w:rPr>
-              <w:t xml:space="preserve"> %}</w:t>
+              <w:t>{% if user_need == 'custody' and alternate_service %}</w:t>
             </w:r>
             <w:r>
               <w:t>Now you wait.</w:t>
@@ -11519,16 +11415,8 @@
               <w:rPr>
                 <w:color w:val="C00000"/>
               </w:rPr>
-              <w:t xml:space="preserve">user_need == 'custody' and </w:t>
-            </w:r>
-            <w:proofErr w:type="spellStart"/>
-            <w:r>
-              <w:rPr>
-                <w:color w:val="C00000"/>
-              </w:rPr>
-              <w:t>alternate_service</w:t>
-            </w:r>
-            <w:proofErr w:type="spellEnd"/>
+              <w:t>user_need == 'custody' and alternate_service</w:t>
+            </w:r>
             <w:r>
               <w:rPr>
                 <w:color w:val="C00000"/>
@@ -12137,21 +12025,7 @@
               <w:rPr>
                 <w:color w:val="00B050"/>
               </w:rPr>
-              <w:t xml:space="preserve"> and which_forms in('</w:t>
-            </w:r>
-            <w:proofErr w:type="spellStart"/>
-            <w:r>
-              <w:rPr>
-                <w:color w:val="00B050"/>
-              </w:rPr>
-              <w:t>contested','both</w:t>
-            </w:r>
-            <w:proofErr w:type="spellEnd"/>
-            <w:r>
-              <w:rPr>
-                <w:color w:val="00B050"/>
-              </w:rPr>
-              <w:t>') %}</w:t>
+              <w:t xml:space="preserve"> and which_forms in('contested','both') %}</w:t>
             </w:r>
           </w:p>
         </w:tc>
@@ -12168,11 +12042,9 @@
             <w:pPr>
               <w:pStyle w:val="Body"/>
             </w:pPr>
-            <w:proofErr w:type="spellStart"/>
             <w:r>
               <w:t>learn_more_about_process_step</w:t>
             </w:r>
-            <w:proofErr w:type="spellEnd"/>
             <w:r>
               <w:t xml:space="preserve"> in </w:t>
             </w:r>
@@ -12410,15 +12282,7 @@
             </w:hyperlink>
             <w:r>
               <w:br/>
-              <w:t>youtube.com/</w:t>
-            </w:r>
-            <w:proofErr w:type="spellStart"/>
-            <w:r>
-              <w:t>watch?v</w:t>
-            </w:r>
-            <w:proofErr w:type="spellEnd"/>
-            <w:r>
-              <w:t>=z2d2CLllPUU</w:t>
+              <w:t>youtube.com/watch?v=z2d2CLllPUU</w:t>
             </w:r>
           </w:p>
           <w:p>
@@ -12442,15 +12306,7 @@
               <w:t>yo</w:t>
             </w:r>
             <w:r>
-              <w:t>utube.com/</w:t>
-            </w:r>
-            <w:proofErr w:type="spellStart"/>
-            <w:r>
-              <w:t>watch?v</w:t>
-            </w:r>
-            <w:proofErr w:type="spellEnd"/>
-            <w:r>
-              <w:t>=EzSV4Caz6Co</w:t>
+              <w:t>utube.com/watch?v=EzSV4Caz6Co</w:t>
             </w:r>
           </w:p>
           <w:p>
@@ -12481,15 +12337,7 @@
               <w:br/>
             </w:r>
             <w:r>
-              <w:t>youtube.com/</w:t>
-            </w:r>
-            <w:proofErr w:type="spellStart"/>
-            <w:r>
-              <w:t>playlist?list</w:t>
-            </w:r>
-            <w:proofErr w:type="spellEnd"/>
-            <w:r>
-              <w:t>=PLRS0LlEIQsuTsfO0wSTsSTIvVE5RO8sLc</w:t>
+              <w:t>youtube.com/playlist?list=PLRS0LlEIQsuTsfO0wSTsSTIvVE5RO8sLc</w:t>
             </w:r>
           </w:p>
           <w:p>
@@ -12508,15 +12356,7 @@
               <w:br/>
             </w:r>
             <w:r>
-              <w:t>aklawselfhelp.org/?</w:t>
-            </w:r>
-            <w:proofErr w:type="spellStart"/>
-            <w:r>
-              <w:t>page_id</w:t>
-            </w:r>
-            <w:proofErr w:type="spellEnd"/>
-            <w:r>
-              <w:t>=29</w:t>
+              <w:t>aklawselfhelp.org/?page_id=29</w:t>
             </w:r>
           </w:p>
           <w:p>
@@ -12558,15 +12398,7 @@
               <w:br/>
             </w:r>
             <w:r>
-              <w:t>youtube.com/</w:t>
-            </w:r>
-            <w:proofErr w:type="spellStart"/>
-            <w:r>
-              <w:t>playlist?list</w:t>
-            </w:r>
-            <w:proofErr w:type="spellEnd"/>
-            <w:r>
-              <w:t>=PL82589B66ED712B4B</w:t>
+              <w:t>youtube.com/playlist?list=PL82589B66ED712B4B</w:t>
             </w:r>
           </w:p>
         </w:tc>
@@ -12665,11 +12497,9 @@
             </w:tcMar>
           </w:tcPr>
           <w:p>
-            <w:proofErr w:type="spellStart"/>
             <w:r>
               <w:t>domestic_violence_step</w:t>
             </w:r>
-            <w:proofErr w:type="spellEnd"/>
             <w:r>
               <w:t xml:space="preserve"> – specific to this interview – needs to be compared with other interviews and combined in branding package</w:t>
             </w:r>
@@ -12757,15 +12587,7 @@
               <w:t xml:space="preserve"> </w:t>
             </w:r>
             <w:r>
-              <w:t>('</w:t>
-            </w:r>
-            <w:proofErr w:type="spellStart"/>
-            <w:r>
-              <w:t>agree','both</w:t>
-            </w:r>
-            <w:proofErr w:type="spellEnd"/>
-            <w:r>
-              <w:t xml:space="preserve">') </w:t>
+              <w:t xml:space="preserve">('agree','both') </w:t>
             </w:r>
             <w:r>
               <w:rPr>
@@ -12937,15 +12759,7 @@
               <w:t xml:space="preserve"> </w:t>
             </w:r>
             <w:r>
-              <w:t>('</w:t>
-            </w:r>
-            <w:proofErr w:type="spellStart"/>
-            <w:r>
-              <w:t>agree','both</w:t>
-            </w:r>
-            <w:proofErr w:type="spellEnd"/>
-            <w:r>
-              <w:t xml:space="preserve">') </w:t>
+              <w:t xml:space="preserve">('agree','both') </w:t>
             </w:r>
             <w:r>
               <w:t>%}However, some parents in a relationship that includes domestic violence are comfortable reaching an agreement about a parenting plan for a variety of reasons.  Sometimes:</w:t>
@@ -13040,15 +12854,7 @@
               <w:t xml:space="preserve"> </w:t>
             </w:r>
             <w:r>
-              <w:t>('</w:t>
-            </w:r>
-            <w:proofErr w:type="spellStart"/>
-            <w:r>
-              <w:t>agree','both</w:t>
-            </w:r>
-            <w:proofErr w:type="spellEnd"/>
-            <w:r>
-              <w:t xml:space="preserve">') </w:t>
+              <w:t xml:space="preserve">('agree','both') </w:t>
             </w:r>
             <w:r>
               <w:t>%}</w:t>
@@ -13355,15 +13161,7 @@
               <w:br/>
             </w:r>
             <w:r>
-              <w:t>andvsa.org/</w:t>
-            </w:r>
-            <w:proofErr w:type="spellStart"/>
-            <w:r>
-              <w:t>communitys</w:t>
-            </w:r>
-            <w:proofErr w:type="spellEnd"/>
-            <w:r>
-              <w:t>-programs</w:t>
+              <w:t>andvsa.org/communitys-programs</w:t>
             </w:r>
           </w:p>
           <w:p>
@@ -13382,13 +13180,8 @@
               <w:br/>
             </w:r>
             <w:r>
-              <w:t>docassemble.akcourts.gov/start/</w:t>
-            </w:r>
-            <w:proofErr w:type="spellStart"/>
-            <w:r>
-              <w:t>ProtectiveOrders</w:t>
-            </w:r>
-            <w:proofErr w:type="spellEnd"/>
+              <w:t>docassemble.akcourts.gov/start/ProtectiveOrders</w:t>
+            </w:r>
           </w:p>
           <w:p>
             <w:pPr>
@@ -13592,16 +13385,11 @@
             </w:tcMar>
           </w:tcPr>
           <w:p>
-            <w:proofErr w:type="spellStart"/>
             <w:r>
               <w:t>default_info_st</w:t>
             </w:r>
             <w:r>
-              <w:t>ep</w:t>
-            </w:r>
-            <w:proofErr w:type="spellEnd"/>
-            <w:r>
-              <w:t xml:space="preserve"> in  </w:t>
+              <w:t xml:space="preserve">ep in  </w:t>
             </w:r>
             <w:hyperlink r:id="rId148" w:anchor="L546" w:history="1">
               <w:r>
@@ -14133,13 +13921,8 @@
             <w:pPr>
               <w:pStyle w:val="Body"/>
             </w:pPr>
-            <w:proofErr w:type="spellStart"/>
-            <w:r>
-              <w:t>get_help_step</w:t>
-            </w:r>
-            <w:proofErr w:type="spellEnd"/>
-            <w:r>
-              <w:t xml:space="preserve"> in </w:t>
+            <w:r>
+              <w:t xml:space="preserve">get_help_step in </w:t>
             </w:r>
             <w:hyperlink r:id="rId158" w:anchor="L671" w:history="1">
               <w:r>
@@ -14472,14 +14255,27 @@
     <w:r>
       <w:t xml:space="preserve"> of </w:t>
     </w:r>
-    <w:fldSimple w:instr=" NUMPAGES  \* Arabic  \* MERGEFORMAT ">
-      <w:r>
-        <w:rPr>
-          <w:noProof/>
-        </w:rPr>
-        <w:t>22</w:t>
-      </w:r>
-    </w:fldSimple>
+    <w:r>
+      <w:fldChar w:fldCharType="begin"/>
+    </w:r>
+    <w:r>
+      <w:instrText xml:space="preserve"> NUMPAGES  \* Arabic  \* MERGEFORMAT </w:instrText>
+    </w:r>
+    <w:r>
+      <w:fldChar w:fldCharType="separate"/>
+    </w:r>
+    <w:r>
+      <w:rPr>
+        <w:noProof/>
+      </w:rPr>
+      <w:t>22</w:t>
+    </w:r>
+    <w:r>
+      <w:rPr>
+        <w:noProof/>
+      </w:rPr>
+      <w:fldChar w:fldCharType="end"/>
+    </w:r>
     <w:r>
       <w:t xml:space="preserve"> pages</w:t>
     </w:r>

</xml_diff>